<commit_message>
docs: record reader traffic optimization
</commit_message>
<xml_diff>
--- a/docs/supabase-traffic-review-2026-10-20/database-traffic-review-2026-10-20.docx
+++ b/docs/supabase-traffic-review-2026-10-20/database-traffic-review-2026-10-20.docx
@@ -1727,6 +1727,82 @@
         <w:t>本次仅做只读检查并形成报告。没有更改 Supabase 数据、架构或应用代码。建议下一步先定位259条 PostgREST 超时的具体请求来源，再决定是否需要调整自动保存和页面缓存。</w:t>
       </w:r>
     </w:p>
+    <w:p>
+      <w:r>
+        <w:br w:type="page"/>
+      </w:r>
+    </w:p>
+    <w:p>
+      <w:pPr>
+        <w:pStyle w:val="Heading1"/>
+      </w:pPr>
+      <w:r>
+        <w:t>7 后续代码优化实施记录</w:t>
+      </w:r>
+    </w:p>
+    <w:p>
+      <w:r>
+        <w:t>根据本次数据库与流量排查，已在 2026 年 10 月 20 日完成阅读书目资源的按需获取优化，门户版本升至 3.30.1。以下记录说明实现行为和测量边界。数据库结构与现有记录均未修改。</w:t>
+      </w:r>
+    </w:p>
+    <w:p>
+      <w:pPr>
+        <w:pStyle w:val="Heading2"/>
+      </w:pPr>
+      <w:r>
+        <w:t>改动范围与行为</w:t>
+      </w:r>
+    </w:p>
+    <w:p>
+      <w:pPr>
+        <w:pStyle w:val="ListBullet"/>
+      </w:pPr>
+      <w:r>
+        <w:t>阅读器初始化仍批量签发封面地址；书籍正文地址只为确实需要自动导入且尚无已托管章节的用户书目预签。已经导入章节的书籍继续通过章节接口读取正文。</w:t>
+      </w:r>
+    </w:p>
+    <w:p>
+      <w:pPr>
+        <w:pStyle w:val="ListBullet"/>
+      </w:pPr>
+      <w:r>
+        <w:t>其他书籍的正文下载地址不再随目录初始化返回。用户开始导入或更新正文时，客户端才调用新的服务端动作获取短期签名地址。服务端校验书目标识格式、书目启用状态、用户授权或当前套餐、功能可见性，并签发一小时有效链接。</w:t>
+      </w:r>
+    </w:p>
+    <w:p>
+      <w:pPr>
+        <w:pStyle w:val="ListBullet"/>
+      </w:pPr>
+      <w:r>
+        <w:t>目录封面改为浏览器懒加载并异步解码。封面文件大小没有改变；它只推迟未进入视口图片的下载，用户滚动查看后仍会按需获取。</w:t>
+      </w:r>
+    </w:p>
+    <w:p>
+      <w:pPr>
+        <w:pStyle w:val="ListBullet"/>
+      </w:pPr>
+      <w:r>
+        <w:t>这些改动减少目录加载时未使用书籍正文链接的签发请求，并延迟屏幕外封面的传输。实际节省字节数取决于用户访问与导入行为，须在发布后结合 Supabase Usage 的实际 egress 指标复核。</w:t>
+      </w:r>
+    </w:p>
+    <w:p>
+      <w:pPr>
+        <w:pStyle w:val="Heading2"/>
+      </w:pPr>
+      <w:r>
+        <w:t>验证范围与后续测量</w:t>
+      </w:r>
+    </w:p>
+    <w:p>
+      <w:r>
+        <w:t>代码差异已检查。此轮未运行自动化测试或生产构建；本机 Supabase 请求日志中的响应长度不能代替网络出口字节统计。优化发布后，建议以相同时间窗口比较 Supabase Dashboard 的 egress、Storage 下载量和应用目录请求量，并观察登录用户、访客及已导入书籍的实际流程。</w:t>
+      </w:r>
+    </w:p>
+    <w:p>
+      <w:r>
+        <w:t>本次只改动应用层书目资源加载，没有执行数据库写入、删除、迁移或清理。先前报告中 schedule_version_backups 的体量仍需独立确认其备份频率与保留策略，不能据本次代码优化推断已解决。</w:t>
+      </w:r>
+    </w:p>
     <w:sectPr>
       <w:footerReference w:type="default" r:id="rId9"/>
       <w:pgSz w:w="12240" w:h="15840"/>

</xml_diff>